<commit_message>
Update submodules, no longer using cell modem
</commit_message>
<xml_diff>
--- a/wispr_rpi.docx
+++ b/wispr_rpi.docx
@@ -1,6 +1,6 @@
 
 <file path=word/document.xml><?xml version="1.0" encoding="utf-8"?>
-<w:document xmlns:wpc="http://schemas.microsoft.com/office/word/2010/wordprocessingCanvas" xmlns:cx="http://schemas.microsoft.com/office/drawing/2014/chartex" xmlns:cx1="http://schemas.microsoft.com/office/drawing/2015/9/8/chartex" xmlns:cx2="http://schemas.microsoft.com/office/drawing/2015/10/21/chartex" xmlns:cx3="http://schemas.microsoft.com/office/drawing/2016/5/9/chartex" xmlns:cx4="http://schemas.microsoft.com/office/drawing/2016/5/10/chartex" xmlns:cx5="http://schemas.microsoft.com/office/drawing/2016/5/11/chartex" xmlns:cx6="http://schemas.microsoft.com/office/drawing/2016/5/12/chartex" xmlns:cx7="http://schemas.microsoft.com/office/drawing/2016/5/13/chartex" xmlns:cx8="http://schemas.microsoft.com/office/drawing/2016/5/14/chartex" xmlns:mc="http://schemas.openxmlformats.org/markup-compatibility/2006" xmlns:aink="http://schemas.microsoft.com/office/drawing/2016/ink" xmlns:am3d="http://schemas.microsoft.com/office/drawing/2017/model3d" xmlns:o="urn:schemas-microsoft-com:office:office" xmlns:oel="http://schemas.microsoft.com/office/2019/extlst" xmlns:r="http://schemas.openxmlformats.org/officeDocument/2006/relationships" xmlns:m="http://schemas.openxmlformats.org/officeDocument/2006/math" xmlns:v="urn:schemas-microsoft-com:vml" xmlns:wp14="http://schemas.microsoft.com/office/word/2010/wordprocessingDrawing" xmlns:wp="http://schemas.openxmlformats.org/drawingml/2006/wordprocessingDrawing" xmlns:w10="urn:schemas-microsoft-com:office:word" xmlns:w="http://schemas.openxmlformats.org/wordprocessingml/2006/main" xmlns:w14="http://schemas.microsoft.com/office/word/2010/wordml" xmlns:w15="http://schemas.microsoft.com/office/word/2012/wordml" xmlns:w16cex="http://schemas.microsoft.com/office/word/2018/wordml/cex" xmlns:w16cid="http://schemas.microsoft.com/office/word/2016/wordml/cid" xmlns:w16="http://schemas.microsoft.com/office/word/2018/wordml" xmlns:w16sdtdh="http://schemas.microsoft.com/office/word/2020/wordml/sdtdatahash" xmlns:w16se="http://schemas.microsoft.com/office/word/2015/wordml/symex" xmlns:wpg="http://schemas.microsoft.com/office/word/2010/wordprocessingGroup" xmlns:wpi="http://schemas.microsoft.com/office/word/2010/wordprocessingInk" xmlns:wne="http://schemas.microsoft.com/office/word/2006/wordml" xmlns:wps="http://schemas.microsoft.com/office/word/2010/wordprocessingShape" mc:Ignorable="w14 w15 w16se w16cid w16 w16cex w16sdtdh wp14">
+<w:document xmlns:wpc="http://schemas.microsoft.com/office/word/2010/wordprocessingCanvas" xmlns:cx="http://schemas.microsoft.com/office/drawing/2014/chartex" xmlns:cx1="http://schemas.microsoft.com/office/drawing/2015/9/8/chartex" xmlns:cx2="http://schemas.microsoft.com/office/drawing/2015/10/21/chartex" xmlns:cx3="http://schemas.microsoft.com/office/drawing/2016/5/9/chartex" xmlns:cx4="http://schemas.microsoft.com/office/drawing/2016/5/10/chartex" xmlns:cx5="http://schemas.microsoft.com/office/drawing/2016/5/11/chartex" xmlns:cx6="http://schemas.microsoft.com/office/drawing/2016/5/12/chartex" xmlns:cx7="http://schemas.microsoft.com/office/drawing/2016/5/13/chartex" xmlns:cx8="http://schemas.microsoft.com/office/drawing/2016/5/14/chartex" xmlns:mc="http://schemas.openxmlformats.org/markup-compatibility/2006" xmlns:aink="http://schemas.microsoft.com/office/drawing/2016/ink" xmlns:am3d="http://schemas.microsoft.com/office/drawing/2017/model3d" xmlns:o="urn:schemas-microsoft-com:office:office" xmlns:oel="http://schemas.microsoft.com/office/2019/extlst" xmlns:r="http://schemas.openxmlformats.org/officeDocument/2006/relationships" xmlns:m="http://schemas.openxmlformats.org/officeDocument/2006/math" xmlns:v="urn:schemas-microsoft-com:vml" xmlns:wp14="http://schemas.microsoft.com/office/word/2010/wordprocessingDrawing" xmlns:wp="http://schemas.openxmlformats.org/drawingml/2006/wordprocessingDrawing" xmlns:w10="urn:schemas-microsoft-com:office:word" xmlns:w="http://schemas.openxmlformats.org/wordprocessingml/2006/main" xmlns:w14="http://schemas.microsoft.com/office/word/2010/wordml" xmlns:w15="http://schemas.microsoft.com/office/word/2012/wordml" xmlns:w16cex="http://schemas.microsoft.com/office/word/2018/wordml/cex" xmlns:w16cid="http://schemas.microsoft.com/office/word/2016/wordml/cid" xmlns:w16="http://schemas.microsoft.com/office/word/2018/wordml" xmlns:w16du="http://schemas.microsoft.com/office/word/2023/wordml/word16du" xmlns:w16sdtdh="http://schemas.microsoft.com/office/word/2020/wordml/sdtdatahash" xmlns:w16sdtfl="http://schemas.microsoft.com/office/word/2024/wordml/sdtformatlock" xmlns:w16se="http://schemas.microsoft.com/office/word/2015/wordml/symex" xmlns:wpg="http://schemas.microsoft.com/office/word/2010/wordprocessingGroup" xmlns:wpi="http://schemas.microsoft.com/office/word/2010/wordprocessingInk" xmlns:wne="http://schemas.microsoft.com/office/word/2006/wordml" xmlns:wps="http://schemas.microsoft.com/office/word/2010/wordprocessingShape" mc:Ignorable="w14 w15 w16se w16cid w16 w16cex w16sdtdh w16sdtfl w16du wp14">
   <w:body>
     <w:p>
       <w:pPr>
@@ -133,7 +133,15 @@
         <w:t>P</w:t>
       </w:r>
       <w:r>
-        <w:t xml:space="preserve">i. So when </w:t>
+        <w:t xml:space="preserve">i. </w:t>
+      </w:r>
+      <w:proofErr w:type="gramStart"/>
+      <w:r>
+        <w:t>So</w:t>
+      </w:r>
+      <w:proofErr w:type="gramEnd"/>
+      <w:r>
+        <w:t xml:space="preserve"> when </w:t>
       </w:r>
       <w:proofErr w:type="spellStart"/>
       <w:r>
@@ -247,7 +255,15 @@
         <w:t>P</w:t>
       </w:r>
       <w:r>
-        <w:t xml:space="preserve">i.  The WISPR processor control the ON/OFF state of this 5V regulator through software. </w:t>
+        <w:t xml:space="preserve">i.  The WISPR processor </w:t>
+      </w:r>
+      <w:proofErr w:type="gramStart"/>
+      <w:r>
+        <w:t>control</w:t>
+      </w:r>
+      <w:proofErr w:type="gramEnd"/>
+      <w:r>
+        <w:t xml:space="preserve"> the ON/OFF state of this 5V regulator through software. </w:t>
       </w:r>
     </w:p>
     <w:p/>
@@ -295,9 +311,9 @@
           <w:szCs w:val="20"/>
           <w:highlight w:val="white"/>
         </w:rPr>
-        <w:t>ioport_set_pin_level</w:t>
-      </w:r>
-      <w:proofErr w:type="spellEnd"/>
+        <w:t>ioport_set_pin_</w:t>
+      </w:r>
+      <w:proofErr w:type="gramStart"/>
       <w:r>
         <w:rPr>
           <w:rFonts w:ascii="Consolas" w:hAnsi="Consolas"/>
@@ -306,18 +322,9 @@
           <w:szCs w:val="20"/>
           <w:highlight w:val="white"/>
         </w:rPr>
-        <w:t>(PIN_ENABLE_5V, 1); // Turn RPI ON</w:t>
-      </w:r>
-    </w:p>
-    <w:p>
-      <w:pPr>
-        <w:rPr>
-          <w:color w:val="158466"/>
-          <w:sz w:val="20"/>
-          <w:szCs w:val="20"/>
-        </w:rPr>
-      </w:pPr>
-      <w:proofErr w:type="spellStart"/>
+        <w:t>level</w:t>
+      </w:r>
+      <w:proofErr w:type="spellEnd"/>
       <w:r>
         <w:rPr>
           <w:rFonts w:ascii="Consolas" w:hAnsi="Consolas"/>
@@ -326,9 +333,9 @@
           <w:szCs w:val="20"/>
           <w:highlight w:val="white"/>
         </w:rPr>
-        <w:t>ioport_set_pin_level</w:t>
-      </w:r>
-      <w:proofErr w:type="spellEnd"/>
+        <w:t>(</w:t>
+      </w:r>
+      <w:proofErr w:type="gramEnd"/>
       <w:r>
         <w:rPr>
           <w:rFonts w:ascii="Consolas" w:hAnsi="Consolas"/>
@@ -337,7 +344,60 @@
           <w:szCs w:val="20"/>
           <w:highlight w:val="white"/>
         </w:rPr>
-        <w:t>(PIN_ENABLE_5V, 0); // Turn RPI OFF</w:t>
+        <w:t>PIN_ENABLE_5V, 1); // Turn RPI ON</w:t>
+      </w:r>
+    </w:p>
+    <w:p>
+      <w:pPr>
+        <w:rPr>
+          <w:color w:val="158466"/>
+          <w:sz w:val="20"/>
+          <w:szCs w:val="20"/>
+        </w:rPr>
+      </w:pPr>
+      <w:proofErr w:type="spellStart"/>
+      <w:r>
+        <w:rPr>
+          <w:rFonts w:ascii="Consolas" w:hAnsi="Consolas"/>
+          <w:color w:val="158466"/>
+          <w:sz w:val="20"/>
+          <w:szCs w:val="20"/>
+          <w:highlight w:val="white"/>
+        </w:rPr>
+        <w:t>ioport_set_pin_</w:t>
+      </w:r>
+      <w:proofErr w:type="gramStart"/>
+      <w:r>
+        <w:rPr>
+          <w:rFonts w:ascii="Consolas" w:hAnsi="Consolas"/>
+          <w:color w:val="158466"/>
+          <w:sz w:val="20"/>
+          <w:szCs w:val="20"/>
+          <w:highlight w:val="white"/>
+        </w:rPr>
+        <w:t>level</w:t>
+      </w:r>
+      <w:proofErr w:type="spellEnd"/>
+      <w:r>
+        <w:rPr>
+          <w:rFonts w:ascii="Consolas" w:hAnsi="Consolas"/>
+          <w:color w:val="158466"/>
+          <w:sz w:val="20"/>
+          <w:szCs w:val="20"/>
+          <w:highlight w:val="white"/>
+        </w:rPr>
+        <w:t>(</w:t>
+      </w:r>
+      <w:proofErr w:type="gramEnd"/>
+      <w:r>
+        <w:rPr>
+          <w:rFonts w:ascii="Consolas" w:hAnsi="Consolas"/>
+          <w:color w:val="158466"/>
+          <w:sz w:val="20"/>
+          <w:szCs w:val="20"/>
+          <w:highlight w:val="white"/>
+        </w:rPr>
+        <w:t>PIN_ENABLE_5V, 0); // Turn RPI OFF</w:t>
       </w:r>
     </w:p>
     <w:p/>
@@ -456,7 +516,15 @@
         <w:t>s</w:t>
       </w:r>
       <w:r>
-        <w:t>. So you will need to install updates and change the R</w:t>
+        <w:t xml:space="preserve">. </w:t>
+      </w:r>
+      <w:proofErr w:type="gramStart"/>
+      <w:r>
+        <w:t>So</w:t>
+      </w:r>
+      <w:proofErr w:type="gramEnd"/>
+      <w:r>
+        <w:t xml:space="preserve"> you will need to install updates and change the R</w:t>
       </w:r>
       <w:r>
         <w:t>P</w:t>
@@ -570,7 +638,17 @@
           <w:sz w:val="20"/>
           <w:szCs w:val="20"/>
         </w:rPr>
-        <w:t>-fuse</w:t>
+        <w:t>-</w:t>
+      </w:r>
+      <w:proofErr w:type="gramStart"/>
+      <w:r>
+        <w:rPr>
+          <w:rFonts w:ascii="Consolas" w:hAnsi="Consolas"/>
+          <w:color w:val="158466"/>
+          <w:sz w:val="20"/>
+          <w:szCs w:val="20"/>
+        </w:rPr>
+        <w:t>fuse</w:t>
       </w:r>
       <w:r>
         <w:rPr>
@@ -599,6 +677,7 @@
         <w:t>exfat</w:t>
       </w:r>
       <w:proofErr w:type="spellEnd"/>
+      <w:proofErr w:type="gramEnd"/>
       <w:r>
         <w:rPr>
           <w:rFonts w:ascii="Consolas" w:hAnsi="Consolas"/>
@@ -752,14 +831,25 @@
         <w:t>=</w:t>
       </w:r>
       <w:proofErr w:type="spellStart"/>
-      <w:r>
-        <w:rPr>
-          <w:rFonts w:ascii="Consolas" w:hAnsi="Consolas"/>
-          <w:color w:val="158466"/>
-          <w:sz w:val="20"/>
-          <w:szCs w:val="20"/>
-        </w:rPr>
-        <w:t>sdio,poll_once</w:t>
+      <w:proofErr w:type="gramStart"/>
+      <w:r>
+        <w:rPr>
+          <w:rFonts w:ascii="Consolas" w:hAnsi="Consolas"/>
+          <w:color w:val="158466"/>
+          <w:sz w:val="20"/>
+          <w:szCs w:val="20"/>
+        </w:rPr>
+        <w:t>sdio,poll</w:t>
+      </w:r>
+      <w:proofErr w:type="gramEnd"/>
+      <w:r>
+        <w:rPr>
+          <w:rFonts w:ascii="Consolas" w:hAnsi="Consolas"/>
+          <w:color w:val="158466"/>
+          <w:sz w:val="20"/>
+          <w:szCs w:val="20"/>
+        </w:rPr>
+        <w:t>_once</w:t>
       </w:r>
       <w:proofErr w:type="spellEnd"/>
       <w:r>
@@ -1065,7 +1155,23 @@
           <w:rFonts w:cs="Liberation Serif"/>
           <w:color w:val="000000"/>
         </w:rPr>
-        <w:t>“~/.profile” to execute every time the RPi boots)</w:t>
+        <w:t>“~</w:t>
+      </w:r>
+      <w:proofErr w:type="gramStart"/>
+      <w:r>
+        <w:rPr>
+          <w:rFonts w:cs="Liberation Serif"/>
+          <w:color w:val="000000"/>
+        </w:rPr>
+        <w:t>/.profile</w:t>
+      </w:r>
+      <w:proofErr w:type="gramEnd"/>
+      <w:r>
+        <w:rPr>
+          <w:rFonts w:cs="Liberation Serif"/>
+          <w:color w:val="000000"/>
+        </w:rPr>
+        <w:t>” to execute every time the RPi boots)</w:t>
       </w:r>
     </w:p>
     <w:p/>
@@ -1294,25 +1400,38 @@
     <w:p/>
     <w:p>
       <w:r>
-        <w:t xml:space="preserve">  Disk ###  Status         Size     Free     </w:t>
-      </w:r>
-      <w:proofErr w:type="spellStart"/>
-      <w:r>
-        <w:t>Dyn</w:t>
-      </w:r>
-      <w:proofErr w:type="spellEnd"/>
-      <w:r>
-        <w:t xml:space="preserve">  </w:t>
+        <w:t xml:space="preserve">  Disk ##</w:t>
+      </w:r>
+      <w:proofErr w:type="gramStart"/>
+      <w:r>
+        <w:t>#  Status</w:t>
+      </w:r>
+      <w:proofErr w:type="gramEnd"/>
+      <w:r>
+        <w:t xml:space="preserve">         Size     Free     </w:t>
+      </w:r>
+      <w:proofErr w:type="gramStart"/>
+      <w:r>
+        <w:t xml:space="preserve">Dyn  </w:t>
       </w:r>
       <w:proofErr w:type="spellStart"/>
       <w:r>
         <w:t>Gpt</w:t>
       </w:r>
       <w:proofErr w:type="spellEnd"/>
-    </w:p>
-    <w:p>
-      <w:r>
-        <w:t xml:space="preserve">  --------  -------------  -------  -------  ---  ---</w:t>
+      <w:proofErr w:type="gramEnd"/>
+    </w:p>
+    <w:p>
+      <w:r>
+        <w:t xml:space="preserve">  -------</w:t>
+      </w:r>
+      <w:proofErr w:type="gramStart"/>
+      <w:r>
+        <w:t xml:space="preserve">-  -------------  -------  -------  --- </w:t>
+      </w:r>
+      <w:proofErr w:type="gramEnd"/>
+      <w:r>
+        <w:t xml:space="preserve"> ---</w:t>
       </w:r>
     </w:p>
     <w:p>
@@ -1396,7 +1515,7 @@
 </file>
 
 <file path=word/styles.xml><?xml version="1.0" encoding="utf-8"?>
-<w:styles xmlns:mc="http://schemas.openxmlformats.org/markup-compatibility/2006" xmlns:r="http://schemas.openxmlformats.org/officeDocument/2006/relationships" xmlns:w="http://schemas.openxmlformats.org/wordprocessingml/2006/main" xmlns:w14="http://schemas.microsoft.com/office/word/2010/wordml" xmlns:w15="http://schemas.microsoft.com/office/word/2012/wordml" xmlns:w16cex="http://schemas.microsoft.com/office/word/2018/wordml/cex" xmlns:w16cid="http://schemas.microsoft.com/office/word/2016/wordml/cid" xmlns:w16="http://schemas.microsoft.com/office/word/2018/wordml" xmlns:w16sdtdh="http://schemas.microsoft.com/office/word/2020/wordml/sdtdatahash" xmlns:w16se="http://schemas.microsoft.com/office/word/2015/wordml/symex" mc:Ignorable="w14 w15 w16se w16cid w16 w16cex w16sdtdh">
+<w:styles xmlns:mc="http://schemas.openxmlformats.org/markup-compatibility/2006" xmlns:r="http://schemas.openxmlformats.org/officeDocument/2006/relationships" xmlns:w="http://schemas.openxmlformats.org/wordprocessingml/2006/main" xmlns:w14="http://schemas.microsoft.com/office/word/2010/wordml" xmlns:w15="http://schemas.microsoft.com/office/word/2012/wordml" xmlns:w16cex="http://schemas.microsoft.com/office/word/2018/wordml/cex" xmlns:w16cid="http://schemas.microsoft.com/office/word/2016/wordml/cid" xmlns:w16="http://schemas.microsoft.com/office/word/2018/wordml" xmlns:w16du="http://schemas.microsoft.com/office/word/2023/wordml/word16du" xmlns:w16sdtdh="http://schemas.microsoft.com/office/word/2020/wordml/sdtdatahash" xmlns:w16sdtfl="http://schemas.microsoft.com/office/word/2024/wordml/sdtformatlock" xmlns:w16se="http://schemas.microsoft.com/office/word/2015/wordml/symex" mc:Ignorable="w14 w15 w16se w16cid w16 w16cex w16sdtdh w16sdtfl w16du">
   <w:docDefaults>
     <w:rPrDefault>
       <w:rPr>

</xml_diff>